<commit_message>
Finished initial cut on stations.csv
</commit_message>
<xml_diff>
--- a/Station descriptions.docx
+++ b/Station descriptions.docx
@@ -383,6 +383,233 @@
       <w:r>
         <w:t>8 trains.</w:t>
       </w:r>
+    </w:p>
+    <w:p/>
+    <w:p>
+      <w:pPr>
+        <w:keepNext/>
+        <w:keepLines/>
+      </w:pPr>
+      <w:r>
+        <w:lastRenderedPageBreak/>
+        <w:t>Onehunga station</w:t>
+      </w:r>
+    </w:p>
+    <w:p>
+      <w:pPr>
+        <w:keepNext/>
+        <w:keepLines/>
+      </w:pPr>
+      <w:r>
+        <w:t xml:space="preserve">Like the Penrose station the Onehunga station opened in 1873 as part of the Auckland to Onehunga line, with the line being extended </w:t>
+      </w:r>
+      <w:r>
+        <w:t>to Onehunga Wharf on 28 November 1878</w:t>
+      </w:r>
+      <w:r>
+        <w:t xml:space="preserve">. </w:t>
+      </w:r>
+      <w:r>
+        <w:t>Onehunga line</w:t>
+      </w:r>
+      <w:r>
+        <w:t xml:space="preserve"> services remained until </w:t>
+      </w:r>
+      <w:r>
+        <w:t xml:space="preserve">services stopped </w:t>
+      </w:r>
+      <w:r>
+        <w:t>in1973 but</w:t>
+      </w:r>
+      <w:r>
+        <w:t xml:space="preserve"> thankfully resumed in 2010 </w:t>
+      </w:r>
+      <w:r>
+        <w:t xml:space="preserve">after much campaigning from </w:t>
+      </w:r>
+      <w:proofErr w:type="gramStart"/>
+      <w:r>
+        <w:t>local residents</w:t>
+      </w:r>
+      <w:proofErr w:type="gramEnd"/>
+      <w:r>
+        <w:t>.</w:t>
+      </w:r>
+    </w:p>
+    <w:p>
+      <w:pPr>
+        <w:keepNext/>
+        <w:keepLines/>
+      </w:pPr>
+      <w:r>
+        <w:t>Located on the Manukau Harbour, Onehunga</w:t>
+      </w:r>
+      <w:r>
+        <w:t xml:space="preserve"> began as a military settlement and over time moved int</w:t>
+      </w:r>
+      <w:r>
+        <w:t>o</w:t>
+      </w:r>
+      <w:r>
+        <w:t xml:space="preserve"> heavy industry </w:t>
+      </w:r>
+      <w:r>
+        <w:t>including 3 freezing works and the Onehunga Ironworks</w:t>
+      </w:r>
+      <w:r>
+        <w:t>. In the early days it</w:t>
+      </w:r>
+      <w:r>
+        <w:t xml:space="preserve"> thrived as a timber and passenger port and today still functions as a secondary port. </w:t>
+      </w:r>
+    </w:p>
+    <w:p>
+      <w:pPr>
+        <w:keepNext/>
+        <w:keepLines/>
+      </w:pPr>
+      <w:r>
+        <w:t xml:space="preserve">With a </w:t>
+      </w:r>
+      <w:r>
+        <w:t>diverse range of shops</w:t>
+      </w:r>
+      <w:r>
+        <w:t xml:space="preserve">, </w:t>
+      </w:r>
+      <w:r>
+        <w:t>cafes</w:t>
+      </w:r>
+      <w:r>
+        <w:t xml:space="preserve">, art and </w:t>
+      </w:r>
+      <w:r>
+        <w:t xml:space="preserve">rich history, including </w:t>
+      </w:r>
+      <w:r>
+        <w:t xml:space="preserve">Elizabeth Yates, the first female mayor in the British Empire </w:t>
+      </w:r>
+      <w:r>
+        <w:t>and Sophia Bates</w:t>
+      </w:r>
+      <w:r>
+        <w:t xml:space="preserve">, </w:t>
+      </w:r>
+      <w:r>
+        <w:t>New Zealand’s first postmistress</w:t>
+      </w:r>
+      <w:r>
+        <w:t>, Onehunga is an excellent place to explore.</w:t>
+      </w:r>
+    </w:p>
+    <w:p>
+      <w:pPr>
+        <w:keepNext/>
+        <w:keepLines/>
+      </w:pPr>
+    </w:p>
+    <w:p>
+      <w:pPr>
+        <w:keepNext/>
+        <w:keepLines/>
+      </w:pPr>
+      <w:r>
+        <w:t>Auckland</w:t>
+      </w:r>
+      <w:r>
+        <w:t xml:space="preserve"> Strand Station</w:t>
+      </w:r>
+    </w:p>
+    <w:p>
+      <w:pPr>
+        <w:keepNext/>
+        <w:keepLines/>
+      </w:pPr>
+      <w:r>
+        <w:t xml:space="preserve">Utilizing </w:t>
+      </w:r>
+      <w:r>
+        <w:t xml:space="preserve">what was </w:t>
+      </w:r>
+      <w:r>
+        <w:t>platform 7 of the old Auckland Railway station</w:t>
+      </w:r>
+      <w:r>
+        <w:t xml:space="preserve"> </w:t>
+      </w:r>
+      <w:r>
+        <w:t xml:space="preserve">the </w:t>
+      </w:r>
+      <w:r>
+        <w:t>Auckland Strand Station</w:t>
+      </w:r>
+      <w:r>
+        <w:t xml:space="preserve"> </w:t>
+      </w:r>
+      <w:r>
+        <w:t>serves as the</w:t>
+      </w:r>
+      <w:r>
+        <w:t xml:space="preserve"> northern</w:t>
+      </w:r>
+      <w:r>
+        <w:t xml:space="preserve"> </w:t>
+      </w:r>
+      <w:r>
+        <w:t xml:space="preserve">terminus for </w:t>
+      </w:r>
+      <w:r>
+        <w:t xml:space="preserve">Northern Explorer services to Wellington and </w:t>
+      </w:r>
+      <w:proofErr w:type="spellStart"/>
+      <w:r>
+        <w:t>Te</w:t>
+      </w:r>
+      <w:proofErr w:type="spellEnd"/>
+      <w:r>
+        <w:t xml:space="preserve"> Huia services to Hamilton. </w:t>
+      </w:r>
+      <w:r>
+        <w:t xml:space="preserve">Unfortunately for Northern Explorer and </w:t>
+      </w:r>
+      <w:proofErr w:type="spellStart"/>
+      <w:r>
+        <w:t>Te</w:t>
+      </w:r>
+      <w:proofErr w:type="spellEnd"/>
+      <w:r>
+        <w:t xml:space="preserve"> Huia passengers their services don’t go to Waitemata </w:t>
+      </w:r>
+      <w:r>
+        <w:t>station,</w:t>
+      </w:r>
+      <w:r>
+        <w:t xml:space="preserve"> nor do Auckland metro trains stop at the Strand.</w:t>
+      </w:r>
+    </w:p>
+    <w:p>
+      <w:pPr>
+        <w:keepNext/>
+        <w:keepLines/>
+      </w:pPr>
+      <w:r>
+        <w:t xml:space="preserve">Sitting alongside the station is </w:t>
+      </w:r>
+      <w:r>
+        <w:t xml:space="preserve">the </w:t>
+      </w:r>
+      <w:r>
+        <w:t>Strand Distributed Stabling Facility</w:t>
+      </w:r>
+      <w:r>
+        <w:t xml:space="preserve"> which holds trains not in use.</w:t>
+      </w:r>
+    </w:p>
+    <w:p>
+      <w:pPr>
+        <w:keepNext/>
+        <w:keepLines/>
+      </w:pPr>
     </w:p>
     <w:sectPr>
       <w:pgSz w:w="11906" w:h="16838"/>
@@ -997,6 +1224,7 @@
   <w:style w:type="character" w:default="1" w:styleId="DefaultParagraphFont">
     <w:name w:val="Default Paragraph Font"/>
     <w:uiPriority w:val="1"/>
+    <w:semiHidden/>
     <w:unhideWhenUsed/>
   </w:style>
   <w:style w:type="table" w:default="1" w:styleId="TableNormal">

</xml_diff>